<commit_message>
docs: actualiza el informe con figuras nuevas, capturas de commits y correcciones
- reemplaza las cinco figuras por las versiones de draw.io
- inserta las capturas de los commits del esqueleto (fases 1 y 2) con enlace al repositorio
- corrige la autoria (Grupo VOX), la estimacion de costos, la tabla de branching y el indice
- agrega el informe exportado en pdf
</commit_message>
<xml_diff>
--- a/Material/TFI_TrainerOS.docx
+++ b/Material/TFI_TrainerOS.docx
@@ -90,7 +90,7 @@
           <w:sz w:val="24"/>
           <w:szCs w:val="24"/>
         </w:rPr>
-        <w:t xml:space="preserve">Autor: Lautaro Naglieri (MMP-SOFTWARE)</w:t>
+        <w:t>Autores — Grupo VOX: Conrado Gómez, Nicolás Zyngale, Matías Saravia, Lautaro Naglieri, Pablo Czurylo, Leandro Gramajo</w:t>
       </w:r>
     </w:p>
     <w:p>
@@ -117,6 +117,54 @@
       </w:pPr>
       <w:r>
         <w:t xml:space="preserve">Índice</w:t>
+      </w:r>
+    </w:p>
+    <w:p>
+      <w:pPr>
+        <w:pStyle w:val="ListParagraph"/>
+      </w:pPr>
+      <w:r>
+        <w:t>Fase 1 — Arquitectura Base y Esqueleto (El MVP)</w:t>
+      </w:r>
+    </w:p>
+    <w:p>
+      <w:pPr>
+        <w:pStyle w:val="ListParagraph"/>
+      </w:pPr>
+      <w:r>
+        <w:t>Fase 2 — Evolución Forzada a Microservicios</w:t>
+      </w:r>
+    </w:p>
+    <w:p>
+      <w:pPr>
+        <w:pStyle w:val="ListParagraph"/>
+      </w:pPr>
+      <w:r>
+        <w:t>Fase 3 — Mejora Incremental (Robustez y Escalabilidad)</w:t>
+      </w:r>
+    </w:p>
+    <w:p>
+      <w:pPr>
+        <w:pStyle w:val="ListParagraph"/>
+      </w:pPr>
+      <w:r>
+        <w:t>Fase 4 — Infraestructura, DevOps y Ambientes</w:t>
+      </w:r>
+    </w:p>
+    <w:p>
+      <w:pPr>
+        <w:pStyle w:val="ListParagraph"/>
+      </w:pPr>
+      <w:r>
+        <w:t>Fase 5 — Extensión de Próxima Generación: Integración con IA</w:t>
+      </w:r>
+    </w:p>
+    <w:p>
+      <w:pPr>
+        <w:pStyle w:val="ListParagraph"/>
+      </w:pPr>
+      <w:r>
+        <w:t>Resumen de la Evolución y Entregables</w:t>
       </w:r>
     </w:p>
     <w:sdt>
@@ -311,37 +359,31 @@
       </w:pPr>
       <w:r>
         <w:drawing>
-          <wp:inline distT="0" distB="0" distL="0" distR="0">
-            <wp:extent cx="5905500" cy="4895850"/>
-            <wp:effectExtent t="0" r="0" b="0" l="0"/>
-            <wp:docPr id="1" name="Figura 1 – Arquitectura inicial: monolito modular en 3 capas" descr="Figura 1 – Arquitectura inicial: monolito modular en 3 capas" title="Figura 1 – Arquitectura inicial: monolito modular en 3 capas"/>
+          <wp:inline xmlns:a="http://schemas.openxmlformats.org/drawingml/2006/main" xmlns:pic="http://schemas.openxmlformats.org/drawingml/2006/picture">
+            <wp:extent cx="5905500" cy="3963601"/>
+            <wp:docPr id="2" name="Picture 2"/>
             <wp:cNvGraphicFramePr>
-              <a:graphicFrameLocks xmlns:a="http://schemas.openxmlformats.org/drawingml/2006/main" noChangeAspect="1"/>
+              <a:graphicFrameLocks noChangeAspect="1"/>
             </wp:cNvGraphicFramePr>
-            <a:graphic xmlns:a="http://schemas.openxmlformats.org/drawingml/2006/main">
+            <a:graphic>
               <a:graphicData uri="http://schemas.openxmlformats.org/drawingml/2006/picture">
-                <pic:pic xmlns:pic="http://schemas.openxmlformats.org/drawingml/2006/picture">
+                <pic:pic>
                   <pic:nvPicPr>
-                    <pic:cNvPr id="0" name="" descr=""/>
-                    <pic:cNvPicPr>
-                      <a:picLocks noChangeAspect="1" noChangeArrowheads="1"/>
-                    </pic:cNvPicPr>
+                    <pic:cNvPr id="0" name="fase1_monolito_3capas.png"/>
+                    <pic:cNvPicPr/>
                   </pic:nvPicPr>
                   <pic:blipFill>
-                    <a:blip r:embed="rId9" cstate="none"/>
-                    <a:srcRect/>
+                    <a:blip r:embed="rId15"/>
                     <a:stretch>
                       <a:fillRect/>
                     </a:stretch>
                   </pic:blipFill>
-                  <pic:spPr bwMode="auto">
+                  <pic:spPr>
                     <a:xfrm>
                       <a:off x="0" y="0"/>
-                      <a:ext cx="5905500" cy="4895850"/>
+                      <a:ext cx="5905500" cy="3963601"/>
                     </a:xfrm>
-                    <a:prstGeom prst="rect">
-                      <a:avLst/>
-                    </a:prstGeom>
+                    <a:prstGeom prst="rect"/>
                   </pic:spPr>
                 </pic:pic>
               </a:graphicData>
@@ -493,16 +535,98 @@
         </w:pBdr>
         <w:shd w:fill="FEF7E0" w:val="clear"/>
         <w:spacing w:after="200" w:before="120"/>
-        <w:jc w:val="both"/>
+        <w:jc w:val="center"/>
+      </w:pPr>
+      <w:r>
+        <w:drawing>
+          <wp:inline xmlns:a="http://schemas.openxmlformats.org/drawingml/2006/main" xmlns:pic="http://schemas.openxmlformats.org/drawingml/2006/picture">
+            <wp:extent cx="5760720" cy="2761783"/>
+            <wp:docPr id="7" name="Picture 7"/>
+            <wp:cNvGraphicFramePr>
+              <a:graphicFrameLocks noChangeAspect="1"/>
+            </wp:cNvGraphicFramePr>
+            <a:graphic>
+              <a:graphicData uri="http://schemas.openxmlformats.org/drawingml/2006/picture">
+                <pic:pic>
+                  <pic:nvPicPr>
+                    <pic:cNvPr id="0" name="PT1.png"/>
+                    <pic:cNvPicPr/>
+                  </pic:nvPicPr>
+                  <pic:blipFill>
+                    <a:blip r:embed="rId20"/>
+                    <a:stretch>
+                      <a:fillRect/>
+                    </a:stretch>
+                  </pic:blipFill>
+                  <pic:spPr>
+                    <a:xfrm>
+                      <a:off x="0" y="0"/>
+                      <a:ext cx="5760720" cy="2761783"/>
+                    </a:xfrm>
+                    <a:prstGeom prst="rect"/>
+                  </pic:spPr>
+                </pic:pic>
+              </a:graphicData>
+            </a:graphic>
+          </wp:inline>
+        </w:drawing>
+      </w:r>
+    </w:p>
+    <w:p>
+      <w:pPr>
+        <w:jc w:val="center"/>
+      </w:pPr>
+      <w:r>
+        <w:drawing>
+          <wp:inline xmlns:a="http://schemas.openxmlformats.org/drawingml/2006/main" xmlns:pic="http://schemas.openxmlformats.org/drawingml/2006/picture">
+            <wp:extent cx="2743200" cy="4899704"/>
+            <wp:docPr id="8" name="Picture 8"/>
+            <wp:cNvGraphicFramePr>
+              <a:graphicFrameLocks noChangeAspect="1"/>
+            </wp:cNvGraphicFramePr>
+            <a:graphic>
+              <a:graphicData uri="http://schemas.openxmlformats.org/drawingml/2006/picture">
+                <pic:pic>
+                  <pic:nvPicPr>
+                    <pic:cNvPr id="0" name="arbol_capas_fase1.png"/>
+                    <pic:cNvPicPr/>
+                  </pic:nvPicPr>
+                  <pic:blipFill>
+                    <a:blip r:embed="rId21"/>
+                    <a:stretch>
+                      <a:fillRect/>
+                    </a:stretch>
+                  </pic:blipFill>
+                  <pic:spPr>
+                    <a:xfrm>
+                      <a:off x="0" y="0"/>
+                      <a:ext cx="2743200" cy="4899704"/>
+                    </a:xfrm>
+                    <a:prstGeom prst="rect"/>
+                  </pic:spPr>
+                </pic:pic>
+              </a:graphicData>
+            </a:graphic>
+          </wp:inline>
+        </w:drawing>
+      </w:r>
+    </w:p>
+    <w:p>
+      <w:pPr>
+        <w:jc w:val="center"/>
       </w:pPr>
       <w:r>
         <w:rPr>
           <w:i/>
-          <w:iCs/>
-          <w:sz w:val="21"/>
-          <w:szCs w:val="21"/>
-        </w:rPr>
-        <w:t xml:space="preserve">[INSERTAR AQUÍ: captura de pantalla de los commits del esqueleto — ej.: “chore: init express + typescript”, “chore: setup prisma + schema base”, “chore: eslint, prettier y husky”, “feat: healthcheck endpoint” — y enlace al repositorio]</w:t>
+          <w:sz w:val="18"/>
+        </w:rPr>
+        <w:t xml:space="preserve">Commits del esqueleto del monolito en capas — Fase 1 (commit 2e1baa5) y estructura de las 3 capas. </w:t>
+      </w:r>
+      <w:r>
+        <w:rPr>
+          <w:sz w:val="18"/>
+        </w:rPr>
+        <w:t>Repositorio: https://github.com/LautaroNaglieri/traineros-api</w:t>
       </w:r>
     </w:p>
     <w:p>
@@ -608,7 +732,7 @@
           <w:i w:val="false"/>
           <w:iCs w:val="false"/>
         </w:rPr>
-        <w:t xml:space="preserve">MMP-SOFTWARE crece a tres equipos (Core de rutinas, Pagos/B2B, Experiencia del alumno) que necesitan desplegar sin coordinarse entre sí.</w:t>
+        <w:t>La empresa crece a tres equipos de desarrollo (Core de rutinas, Pagos/B2B, Experiencia del alumno) que necesitan desplegar sin coordinarse entre sí.</w:t>
       </w:r>
     </w:p>
     <w:p>
@@ -854,37 +978,31 @@
       </w:pPr>
       <w:r>
         <w:drawing>
-          <wp:inline distT="0" distB="0" distL="0" distR="0">
-            <wp:extent cx="5905500" cy="4562475"/>
-            <wp:effectExtent t="0" r="0" b="0" l="0"/>
-            <wp:docPr id="1" name="Figura 2 – Paso A: microservicios tradicionales con comunicación REST síncrona" descr="Figura 2 – Paso A: microservicios tradicionales con comunicación REST síncrona" title="Figura 2 – Paso A: microservicios tradicionales con comunicación REST síncrona"/>
+          <wp:inline xmlns:a="http://schemas.openxmlformats.org/drawingml/2006/main" xmlns:pic="http://schemas.openxmlformats.org/drawingml/2006/picture">
+            <wp:extent cx="5905500" cy="2806340"/>
+            <wp:docPr id="3" name="Picture 3"/>
             <wp:cNvGraphicFramePr>
-              <a:graphicFrameLocks xmlns:a="http://schemas.openxmlformats.org/drawingml/2006/main" noChangeAspect="1"/>
+              <a:graphicFrameLocks noChangeAspect="1"/>
             </wp:cNvGraphicFramePr>
-            <a:graphic xmlns:a="http://schemas.openxmlformats.org/drawingml/2006/main">
+            <a:graphic>
               <a:graphicData uri="http://schemas.openxmlformats.org/drawingml/2006/picture">
-                <pic:pic xmlns:pic="http://schemas.openxmlformats.org/drawingml/2006/picture">
+                <pic:pic>
                   <pic:nvPicPr>
-                    <pic:cNvPr id="0" name="" descr=""/>
-                    <pic:cNvPicPr>
-                      <a:picLocks noChangeAspect="1" noChangeArrowheads="1"/>
-                    </pic:cNvPicPr>
+                    <pic:cNvPr id="0" name="fase2a_microservicios_tradicionales.png"/>
+                    <pic:cNvPicPr/>
                   </pic:nvPicPr>
                   <pic:blipFill>
-                    <a:blip r:embed="rId10" cstate="none"/>
-                    <a:srcRect/>
+                    <a:blip r:embed="rId16"/>
                     <a:stretch>
                       <a:fillRect/>
                     </a:stretch>
                   </pic:blipFill>
-                  <pic:spPr bwMode="auto">
+                  <pic:spPr>
                     <a:xfrm>
                       <a:off x="0" y="0"/>
-                      <a:ext cx="5905500" cy="4562475"/>
+                      <a:ext cx="5905500" cy="2806340"/>
                     </a:xfrm>
-                    <a:prstGeom prst="rect">
-                      <a:avLst/>
-                    </a:prstGeom>
+                    <a:prstGeom prst="rect"/>
                   </pic:spPr>
                 </pic:pic>
               </a:graphicData>
@@ -981,37 +1099,31 @@
       </w:pPr>
       <w:r>
         <w:drawing>
-          <wp:inline distT="0" distB="0" distL="0" distR="0">
-            <wp:extent cx="5905500" cy="3533775"/>
-            <wp:effectExtent t="0" r="0" b="0" l="0"/>
-            <wp:docPr id="1" name="Figura 3 – Paso B: arquitectura orientada a eventos con Pub/Sub" descr="Figura 3 – Paso B: arquitectura orientada a eventos con Pub/Sub" title="Figura 3 – Paso B: arquitectura orientada a eventos con Pub/Sub"/>
+          <wp:inline xmlns:a="http://schemas.openxmlformats.org/drawingml/2006/main" xmlns:pic="http://schemas.openxmlformats.org/drawingml/2006/picture">
+            <wp:extent cx="5905500" cy="2750215"/>
+            <wp:docPr id="4" name="Picture 4"/>
             <wp:cNvGraphicFramePr>
-              <a:graphicFrameLocks xmlns:a="http://schemas.openxmlformats.org/drawingml/2006/main" noChangeAspect="1"/>
+              <a:graphicFrameLocks noChangeAspect="1"/>
             </wp:cNvGraphicFramePr>
-            <a:graphic xmlns:a="http://schemas.openxmlformats.org/drawingml/2006/main">
+            <a:graphic>
               <a:graphicData uri="http://schemas.openxmlformats.org/drawingml/2006/picture">
-                <pic:pic xmlns:pic="http://schemas.openxmlformats.org/drawingml/2006/picture">
+                <pic:pic>
                   <pic:nvPicPr>
-                    <pic:cNvPr id="0" name="" descr=""/>
-                    <pic:cNvPicPr>
-                      <a:picLocks noChangeAspect="1" noChangeArrowheads="1"/>
-                    </pic:cNvPicPr>
+                    <pic:cNvPr id="0" name="fase2b_microservicios_modernos.png"/>
+                    <pic:cNvPicPr/>
                   </pic:nvPicPr>
                   <pic:blipFill>
-                    <a:blip r:embed="rId11" cstate="none"/>
-                    <a:srcRect/>
+                    <a:blip r:embed="rId17"/>
                     <a:stretch>
                       <a:fillRect/>
                     </a:stretch>
                   </pic:blipFill>
-                  <pic:spPr bwMode="auto">
+                  <pic:spPr>
                     <a:xfrm>
                       <a:off x="0" y="0"/>
-                      <a:ext cx="5905500" cy="3533775"/>
+                      <a:ext cx="5905500" cy="2750215"/>
                     </a:xfrm>
-                    <a:prstGeom prst="rect">
-                      <a:avLst/>
-                    </a:prstGeom>
+                    <a:prstGeom prst="rect"/>
                   </pic:spPr>
                 </pic:pic>
               </a:graphicData>
@@ -1734,16 +1846,98 @@
         </w:pBdr>
         <w:shd w:fill="FEF7E0" w:val="clear"/>
         <w:spacing w:after="200" w:before="120"/>
-        <w:jc w:val="both"/>
+        <w:jc w:val="center"/>
+      </w:pPr>
+      <w:r>
+        <w:drawing>
+          <wp:inline xmlns:a="http://schemas.openxmlformats.org/drawingml/2006/main" xmlns:pic="http://schemas.openxmlformats.org/drawingml/2006/picture">
+            <wp:extent cx="5760720" cy="2382501"/>
+            <wp:docPr id="9" name="Picture 9"/>
+            <wp:cNvGraphicFramePr>
+              <a:graphicFrameLocks noChangeAspect="1"/>
+            </wp:cNvGraphicFramePr>
+            <a:graphic>
+              <a:graphicData uri="http://schemas.openxmlformats.org/drawingml/2006/picture">
+                <pic:pic>
+                  <pic:nvPicPr>
+                    <pic:cNvPr id="0" name="PT-1.png"/>
+                    <pic:cNvPicPr/>
+                  </pic:nvPicPr>
+                  <pic:blipFill>
+                    <a:blip r:embed="rId22"/>
+                    <a:stretch>
+                      <a:fillRect/>
+                    </a:stretch>
+                  </pic:blipFill>
+                  <pic:spPr>
+                    <a:xfrm>
+                      <a:off x="0" y="0"/>
+                      <a:ext cx="5760720" cy="2382501"/>
+                    </a:xfrm>
+                    <a:prstGeom prst="rect"/>
+                  </pic:spPr>
+                </pic:pic>
+              </a:graphicData>
+            </a:graphic>
+          </wp:inline>
+        </w:drawing>
+      </w:r>
+    </w:p>
+    <w:p>
+      <w:pPr>
+        <w:jc w:val="center"/>
+      </w:pPr>
+      <w:r>
+        <w:drawing>
+          <wp:inline xmlns:a="http://schemas.openxmlformats.org/drawingml/2006/main" xmlns:pic="http://schemas.openxmlformats.org/drawingml/2006/picture">
+            <wp:extent cx="3108960" cy="5219466"/>
+            <wp:docPr id="10" name="Picture 10"/>
+            <wp:cNvGraphicFramePr>
+              <a:graphicFrameLocks noChangeAspect="1"/>
+            </wp:cNvGraphicFramePr>
+            <a:graphic>
+              <a:graphicData uri="http://schemas.openxmlformats.org/drawingml/2006/picture">
+                <pic:pic>
+                  <pic:nvPicPr>
+                    <pic:cNvPr id="0" name="arbol_monorepo_fase2.png"/>
+                    <pic:cNvPicPr/>
+                  </pic:nvPicPr>
+                  <pic:blipFill>
+                    <a:blip r:embed="rId23"/>
+                    <a:stretch>
+                      <a:fillRect/>
+                    </a:stretch>
+                  </pic:blipFill>
+                  <pic:spPr>
+                    <a:xfrm>
+                      <a:off x="0" y="0"/>
+                      <a:ext cx="3108960" cy="5219466"/>
+                    </a:xfrm>
+                    <a:prstGeom prst="rect"/>
+                  </pic:spPr>
+                </pic:pic>
+              </a:graphicData>
+            </a:graphic>
+          </wp:inline>
+        </w:drawing>
+      </w:r>
+    </w:p>
+    <w:p>
+      <w:pPr>
+        <w:jc w:val="center"/>
       </w:pPr>
       <w:r>
         <w:rPr>
           <w:i/>
-          <w:iCs/>
-          <w:sz w:val="21"/>
-          <w:szCs w:val="21"/>
-        </w:rPr>
-        <w:t xml:space="preserve">[INSERTAR AQUÍ: captura de los primeros commits del esqueleto de los microservicios interconectados — ej. monorepo con /services/auth, /services/rutinas, /services/pagos, docker-compose con Pub/Sub emulator — y enlace al repositorio]</w:t>
+          <w:sz w:val="18"/>
+        </w:rPr>
+        <w:t xml:space="preserve">Commits del esqueleto del monorepo de microservicios — Fase 2 (commit c743488): gateway + 5 servicios, shared-contracts y docker-compose con Pub/Sub. </w:t>
+      </w:r>
+      <w:r>
+        <w:rPr>
+          <w:sz w:val="18"/>
+        </w:rPr>
+        <w:t>Repositorio: https://github.com/LautaroNaglieri/traineros-api</w:t>
       </w:r>
     </w:p>
     <w:p>
@@ -2078,37 +2272,31 @@
       </w:pPr>
       <w:r>
         <w:drawing>
-          <wp:inline distT="0" distB="0" distL="0" distR="0">
-            <wp:extent cx="5905500" cy="5000625"/>
-            <wp:effectExtent t="0" r="0" b="0" l="0"/>
-            <wp:docPr id="1" name="Figura 4 – Arquitectura escalada: LB, auto-scaling, caché y read replicas" descr="Figura 4 – Arquitectura escalada: LB, auto-scaling, caché y read replicas" title="Figura 4 – Arquitectura escalada: LB, auto-scaling, caché y read replicas"/>
+          <wp:inline xmlns:a="http://schemas.openxmlformats.org/drawingml/2006/main" xmlns:pic="http://schemas.openxmlformats.org/drawingml/2006/picture">
+            <wp:extent cx="5905500" cy="3397504"/>
+            <wp:docPr id="5" name="Picture 5"/>
             <wp:cNvGraphicFramePr>
-              <a:graphicFrameLocks xmlns:a="http://schemas.openxmlformats.org/drawingml/2006/main" noChangeAspect="1"/>
+              <a:graphicFrameLocks noChangeAspect="1"/>
             </wp:cNvGraphicFramePr>
-            <a:graphic xmlns:a="http://schemas.openxmlformats.org/drawingml/2006/main">
+            <a:graphic>
               <a:graphicData uri="http://schemas.openxmlformats.org/drawingml/2006/picture">
-                <pic:pic xmlns:pic="http://schemas.openxmlformats.org/drawingml/2006/picture">
+                <pic:pic>
                   <pic:nvPicPr>
-                    <pic:cNvPr id="0" name="" descr=""/>
-                    <pic:cNvPicPr>
-                      <a:picLocks noChangeAspect="1" noChangeArrowheads="1"/>
-                    </pic:cNvPicPr>
+                    <pic:cNvPr id="0" name="fase3_arquitectura_escalada.png"/>
+                    <pic:cNvPicPr/>
                   </pic:nvPicPr>
                   <pic:blipFill>
-                    <a:blip r:embed="rId12" cstate="none"/>
-                    <a:srcRect/>
+                    <a:blip r:embed="rId18"/>
                     <a:stretch>
                       <a:fillRect/>
                     </a:stretch>
                   </pic:blipFill>
-                  <pic:spPr bwMode="auto">
+                  <pic:spPr>
                     <a:xfrm>
                       <a:off x="0" y="0"/>
-                      <a:ext cx="5905500" cy="5000625"/>
+                      <a:ext cx="5905500" cy="3397504"/>
                     </a:xfrm>
-                    <a:prstGeom prst="rect">
-                      <a:avLst/>
-                    </a:prstGeom>
+                    <a:prstGeom prst="rect"/>
                   </pic:spPr>
                 </pic:pic>
               </a:graphicData>
@@ -2958,7 +3146,7 @@
                 <w:sz w:val="20"/>
                 <w:szCs w:val="20"/>
               </w:rPr>
-              <w:t xml:space="preserve">feat/* | fix/* (PR abierto)</w:t>
+              <w:t>feat/* · fix/* (PR abierto)</w:t>
             </w:r>
           </w:p>
         </w:tc>
@@ -4535,7 +4723,7 @@
                 <w:sz w:val="20"/>
                 <w:szCs w:val="20"/>
               </w:rPr>
-              <w:t xml:space="preserve">6 tópicos + DLQs</w:t>
+              <w:t>6 tópicos (4 de negocio + 2 de IA) + DLQs</w:t>
             </w:r>
           </w:p>
         </w:tc>
@@ -5373,7 +5561,7 @@
           <w:i w:val="false"/>
           <w:iCs w:val="false"/>
         </w:rPr>
-        <w:t xml:space="preserve">QA + UAT suman ≈ USD 120–150/mes adicionales </w:t>
+        <w:t xml:space="preserve">QA + UAT suman ≈ USD 150/mes adicionales </w:t>
       </w:r>
       <w:r>
         <w:rPr>
@@ -5683,37 +5871,31 @@
       </w:pPr>
       <w:r>
         <w:drawing>
-          <wp:inline distT="0" distB="0" distL="0" distR="0">
-            <wp:extent cx="5905500" cy="4419600"/>
-            <wp:effectExtent t="0" r="0" b="0" l="0"/>
-            <wp:docPr id="1" name="Figura 5 – Flujo asíncrono de integración con APIs de LLM" descr="Figura 5 – Flujo asíncrono de integración con APIs de LLM" title="Figura 5 – Flujo asíncrono de integración con APIs de LLM"/>
+          <wp:inline xmlns:a="http://schemas.openxmlformats.org/drawingml/2006/main" xmlns:pic="http://schemas.openxmlformats.org/drawingml/2006/picture">
+            <wp:extent cx="5905500" cy="2600569"/>
+            <wp:docPr id="6" name="Picture 6"/>
             <wp:cNvGraphicFramePr>
-              <a:graphicFrameLocks xmlns:a="http://schemas.openxmlformats.org/drawingml/2006/main" noChangeAspect="1"/>
+              <a:graphicFrameLocks noChangeAspect="1"/>
             </wp:cNvGraphicFramePr>
-            <a:graphic xmlns:a="http://schemas.openxmlformats.org/drawingml/2006/main">
+            <a:graphic>
               <a:graphicData uri="http://schemas.openxmlformats.org/drawingml/2006/picture">
-                <pic:pic xmlns:pic="http://schemas.openxmlformats.org/drawingml/2006/picture">
+                <pic:pic>
                   <pic:nvPicPr>
-                    <pic:cNvPr id="0" name="" descr=""/>
-                    <pic:cNvPicPr>
-                      <a:picLocks noChangeAspect="1" noChangeArrowheads="1"/>
-                    </pic:cNvPicPr>
+                    <pic:cNvPr id="0" name="fase5_integracion_ia.png"/>
+                    <pic:cNvPicPr/>
                   </pic:nvPicPr>
                   <pic:blipFill>
-                    <a:blip r:embed="rId13" cstate="none"/>
-                    <a:srcRect/>
+                    <a:blip r:embed="rId19"/>
                     <a:stretch>
                       <a:fillRect/>
                     </a:stretch>
                   </pic:blipFill>
-                  <pic:spPr bwMode="auto">
+                  <pic:spPr>
                     <a:xfrm>
                       <a:off x="0" y="0"/>
-                      <a:ext cx="5905500" cy="4419600"/>
+                      <a:ext cx="5905500" cy="2600569"/>
                     </a:xfrm>
-                    <a:prstGeom prst="rect">
-                      <a:avLst/>
-                    </a:prstGeom>
+                    <a:prstGeom prst="rect"/>
                   </pic:spPr>
                 </pic:pic>
               </a:graphicData>

</xml_diff>

<commit_message>
docs: refuerza el informe con las correcciones de la revision
- fase 3: dimensionamiento cuantitativo del pico, Redis con rate limiting y tokens en lugar de sesiones, Redis vs Memcached y objetivos RTO/RPO
- fase 4: corrige el costo del cluster GKE multi-zona, suma egress/CDN, Cloud NAT y workers de IA, y secretos con Secret Manager + Workload Identity
- fase 5: agrega el bosquejo de la opcion B (RAG) con su diagrama y los guardrails de salida del LLM
- actualiza el informe exportado en pdf
</commit_message>
<xml_diff>
--- a/Material/TFI_TrainerOS.docx
+++ b/Material/TFI_TrainerOS.docx
@@ -1972,31 +1972,7 @@
         <w:jc w:val="both"/>
       </w:pPr>
       <w:r>
-        <w:rPr>
-          <w:b w:val="false"/>
-          <w:bCs w:val="false"/>
-          <w:i w:val="false"/>
-          <w:iCs w:val="false"/>
-        </w:rPr>
-        <w:t xml:space="preserve">Se incorpora </w:t>
-      </w:r>
-      <w:r>
-        <w:rPr>
-          <w:b/>
-          <w:bCs/>
-          <w:i w:val="false"/>
-          <w:iCs w:val="false"/>
-        </w:rPr>
-        <w:t xml:space="preserve">Memorystore for Redis</w:t>
-      </w:r>
-      <w:r>
-        <w:rPr>
-          <w:b w:val="false"/>
-          <w:bCs w:val="false"/>
-          <w:i w:val="false"/>
-          <w:iCs w:val="false"/>
-        </w:rPr>
-        <w:t xml:space="preserve"> con estrategia cache-aside. Qué se cachea y por qué: (a) el catálogo de ejercicios (global, casi inmutable, TTL 24 h) — elimina la carga de lectura más repetida del sistema; (b) la “rutina del día” por alumno (TTL 1 h, invalidación al recibir rutina.asignada) — absorbe el pico de las 18–21 h; (c) sesiones y contadores de rate limiting del Gateway. Con esto, la mayoría de las lecturas del pico nunca llegan a PostgreSQL.</w:t>
+        <w:t>Se incorpora Memorystore for Redis con estrategia cache-aside. Qué se cachea y por qué: (a) el catálogo de ejercicios (global, casi inmutable, TTL 24 h) — elimina la carga de lectura más repetida; (b) la “rutina del día” por alumno (TTL 1 h, invalidación al recibir rutina.asignada) — absorbe el pico de las 18–21 h; (c) contadores de rate limiting, blocklist de tokens revocados y refresh tokens del Gateway (la autenticación es JWT stateless: en Redis no hay sesiones que guardar, sino estos artefactos de control). Con esto, la mayoría de las lecturas del pico nunca llegan a PostgreSQL. Se elige Redis sobre Memcached por sus estructuras de datos, TTL por clave, persistencia opcional y Pub/Sub, que el sistema ya aprovecha.</w:t>
       </w:r>
     </w:p>
     <w:p>
@@ -2079,6 +2055,9 @@
         </w:rPr>
         <w:t xml:space="preserve">cada microservicio escala por CPU/RPS; Rutinas y Query escalan agresivamente en el pico de la tarde y se contraen de madrugada.</w:t>
       </w:r>
+      <w:r>
+        <w:t xml:space="preserve"> Las métricas de CPU/RPS que disparan el HPA provienen de Cloud Monitoring (ver Fase 4).</w:t>
+      </w:r>
     </w:p>
     <w:p>
       <w:pPr>
@@ -2137,6 +2116,17 @@
       </w:r>
     </w:p>
     <w:p>
+      <w:r>
+        <w:rPr>
+          <w:b/>
+        </w:rPr>
+        <w:t xml:space="preserve">Dimensionamiento del pico (estimación). </w:t>
+      </w:r>
+      <w:r>
+        <w:t>Con ~120.000 alumnos activos y la consulta concentrada entre las 18 y 21 h, si la mitad abre su rutina en esa franja y los lunes el pico se triplica, se llega a un orden de ~150–200 lecturas/seg sostenidas. Con un hit-rate de caché del ~90% sobre el catálogo y la “rutina del día”, solo ~15–20 req/seg llegan a PostgreSQL; ese remanente, más los reportes, lo absorben la primaria y 1–2 read replicas con holgura. Es decir: la caché es lo que evita escalar la base de datos, y el HPA solo suma réplicas de cómputo (no de datos) en la franja pico. Son estimaciones de diseño para dimensionar, no medidas de producción.</w:t>
+      </w:r>
+    </w:p>
+    <w:p>
       <w:pPr>
         <w:pStyle w:val="Heading2"/>
       </w:pPr>
@@ -2263,6 +2253,19 @@
           <w:iCs w:val="false"/>
         </w:rPr>
         <w:t xml:space="preserve">los consumidores procesan eventos duplicados sin efectos secundarios (Pub/Sub garantiza at-least-once).</w:t>
+      </w:r>
+    </w:p>
+    <w:p>
+      <w:pPr>
+        <w:pStyle w:val="ListParagraph"/>
+        <w:numPr>
+          <w:ilvl w:val="0"/>
+          <w:numId w:val="2"/>
+        </w:numPr>
+        <w:spacing w:after="80" w:line="300"/>
+      </w:pPr>
+      <w:r>
+        <w:t>Objetivos de recuperación: RPO ≈ 5 min (point-in-time recovery de Cloud SQL) y RTO ≈ 30 min (failover automático de la primaria más redeploy desde la imagen Docker inmutable).</w:t>
       </w:r>
     </w:p>
     <w:p>
@@ -3610,7 +3613,7 @@
           <w:i w:val="false"/>
           <w:iCs w:val="false"/>
         </w:rPr>
-        <w:t xml:space="preserve">escala los pods por CPU/RPS (Fase 3); ConfigMaps y Secrets inyectan la configuración por ambiente.</w:t>
+        <w:t>escala los pods por CPU/RPS (Fase 3); ConfigMaps inyectan la configuración por ambiente; los secretos se gestionan con Secret Manager de GCP accedido vía Workload Identity, no como Secrets de Kubernetes en texto plano.</w:t>
       </w:r>
     </w:p>
     <w:p>
@@ -4168,14 +4171,7 @@
           </w:tcPr>
           <w:p>
             <w:r>
-              <w:rPr>
-                <w:b w:val="false"/>
-                <w:bCs w:val="false"/>
-                <w:color w:val="000000"/>
-                <w:sz w:val="20"/>
-                <w:szCs w:val="20"/>
-              </w:rPr>
-              <w:t xml:space="preserve">$0 (crédito free tier cubre 1 cluster)</w:t>
+              <w:t>$74 (cluster regional multi-zona; el free tier solo cubre 1 cluster zonal/Autopilot)</w:t>
             </w:r>
           </w:p>
         </w:tc>
@@ -4594,14 +4590,7 @@
           </w:tcPr>
           <w:p>
             <w:r>
-              <w:rPr>
-                <w:b w:val="false"/>
-                <w:bCs w:val="false"/>
-                <w:color w:val="000000"/>
-                <w:sz w:val="20"/>
-                <w:szCs w:val="20"/>
-              </w:rPr>
-              <w:t xml:space="preserve">Caché de catálogo, rutinas y sesiones</w:t>
+              <w:t>Caché de catálogo, rutinas y rate limiting</w:t>
             </w:r>
           </w:p>
         </w:tc>
@@ -5406,6 +5395,357 @@
               <w:bottom w:val="single" w:color="BBBBBB" w:sz="1"/>
               <w:right w:val="single" w:color="BBBBBB" w:sz="1"/>
             </w:tcBorders>
+            <w:shd w:fill="FFFFFF" w:val="clear"/>
+            <w:tcMar>
+              <w:top w:type="dxa" w:w="80"/>
+              <w:left w:type="dxa" w:w="120"/>
+              <w:bottom w:type="dxa" w:w="80"/>
+              <w:right w:type="dxa" w:w="120"/>
+            </w:tcMar>
+          </w:tcPr>
+          <w:p>
+            <w:r>
+              <w:t>Egress / CDN</w:t>
+            </w:r>
+          </w:p>
+        </w:tc>
+        <w:tc>
+          <w:tcPr>
+            <w:tcW w:type="dxa" w:w="2350"/>
+            <w:tcBorders>
+              <w:top w:val="single" w:color="BBBBBB" w:sz="1"/>
+              <w:left w:val="single" w:color="BBBBBB" w:sz="1"/>
+              <w:bottom w:val="single" w:color="BBBBBB" w:sz="1"/>
+              <w:right w:val="single" w:color="BBBBBB" w:sz="1"/>
+            </w:tcBorders>
+            <w:shd w:fill="FFFFFF" w:val="clear"/>
+            <w:tcMar>
+              <w:top w:type="dxa" w:w="80"/>
+              <w:left w:type="dxa" w:w="120"/>
+              <w:bottom w:type="dxa" w:w="80"/>
+              <w:right w:type="dxa" w:w="120"/>
+            </w:tcMar>
+          </w:tcPr>
+          <w:p>
+            <w:r>
+              <w:t>Cloud CDN + ancho de banda de salida</w:t>
+            </w:r>
+          </w:p>
+        </w:tc>
+        <w:tc>
+          <w:tcPr>
+            <w:tcW w:type="dxa" w:w="1330"/>
+            <w:tcBorders>
+              <w:top w:val="single" w:color="BBBBBB" w:sz="1"/>
+              <w:left w:val="single" w:color="BBBBBB" w:sz="1"/>
+              <w:bottom w:val="single" w:color="BBBBBB" w:sz="1"/>
+              <w:right w:val="single" w:color="BBBBBB" w:sz="1"/>
+            </w:tcBorders>
+            <w:shd w:fill="FFFFFF" w:val="clear"/>
+            <w:tcMar>
+              <w:top w:type="dxa" w:w="80"/>
+              <w:left w:type="dxa" w:w="120"/>
+              <w:bottom w:type="dxa" w:w="80"/>
+              <w:right w:type="dxa" w:w="120"/>
+            </w:tcMar>
+          </w:tcPr>
+          <w:p>
+            <w:r>
+              <w:t>—</w:t>
+            </w:r>
+          </w:p>
+        </w:tc>
+        <w:tc>
+          <w:tcPr>
+            <w:tcW w:type="dxa" w:w="2150"/>
+            <w:tcBorders>
+              <w:top w:val="single" w:color="BBBBBB" w:sz="1"/>
+              <w:left w:val="single" w:color="BBBBBB" w:sz="1"/>
+              <w:bottom w:val="single" w:color="BBBBBB" w:sz="1"/>
+              <w:right w:val="single" w:color="BBBBBB" w:sz="1"/>
+            </w:tcBorders>
+            <w:shd w:fill="FFFFFF" w:val="clear"/>
+            <w:tcMar>
+              <w:top w:type="dxa" w:w="80"/>
+              <w:left w:type="dxa" w:w="120"/>
+              <w:bottom w:type="dxa" w:w="80"/>
+              <w:right w:type="dxa" w:w="120"/>
+            </w:tcMar>
+          </w:tcPr>
+          <w:p>
+            <w:r>
+              <w:t>Entrega de assets y respuestas</w:t>
+            </w:r>
+          </w:p>
+        </w:tc>
+        <w:tc>
+          <w:tcPr>
+            <w:tcW w:type="dxa" w:w="1480"/>
+            <w:tcBorders>
+              <w:top w:val="single" w:color="BBBBBB" w:sz="1"/>
+              <w:left w:val="single" w:color="BBBBBB" w:sz="1"/>
+              <w:bottom w:val="single" w:color="BBBBBB" w:sz="1"/>
+              <w:right w:val="single" w:color="BBBBBB" w:sz="1"/>
+            </w:tcBorders>
+            <w:shd w:fill="FFFFFF" w:val="clear"/>
+            <w:tcMar>
+              <w:top w:type="dxa" w:w="80"/>
+              <w:left w:type="dxa" w:w="120"/>
+              <w:bottom w:type="dxa" w:w="80"/>
+              <w:right w:type="dxa" w:w="120"/>
+            </w:tcMar>
+          </w:tcPr>
+          <w:p>
+            <w:r>
+              <w:t>$30</w:t>
+            </w:r>
+          </w:p>
+        </w:tc>
+      </w:tr>
+      <w:tr>
+        <w:tc>
+          <w:tcPr>
+            <w:tcW w:type="dxa" w:w="2050"/>
+            <w:tcBorders>
+              <w:top w:val="single" w:color="BBBBBB" w:sz="1"/>
+              <w:left w:val="single" w:color="BBBBBB" w:sz="1"/>
+              <w:bottom w:val="single" w:color="BBBBBB" w:sz="1"/>
+              <w:right w:val="single" w:color="BBBBBB" w:sz="1"/>
+            </w:tcBorders>
+            <w:shd w:fill="FFFFFF" w:val="clear"/>
+            <w:tcMar>
+              <w:top w:type="dxa" w:w="80"/>
+              <w:left w:type="dxa" w:w="120"/>
+              <w:bottom w:type="dxa" w:w="80"/>
+              <w:right w:type="dxa" w:w="120"/>
+            </w:tcMar>
+          </w:tcPr>
+          <w:p>
+            <w:r>
+              <w:t>Red (NAT)</w:t>
+            </w:r>
+          </w:p>
+        </w:tc>
+        <w:tc>
+          <w:tcPr>
+            <w:tcW w:type="dxa" w:w="2350"/>
+            <w:tcBorders>
+              <w:top w:val="single" w:color="BBBBBB" w:sz="1"/>
+              <w:left w:val="single" w:color="BBBBBB" w:sz="1"/>
+              <w:bottom w:val="single" w:color="BBBBBB" w:sz="1"/>
+              <w:right w:val="single" w:color="BBBBBB" w:sz="1"/>
+            </w:tcBorders>
+            <w:shd w:fill="FFFFFF" w:val="clear"/>
+            <w:tcMar>
+              <w:top w:type="dxa" w:w="80"/>
+              <w:left w:type="dxa" w:w="120"/>
+              <w:bottom w:type="dxa" w:w="80"/>
+              <w:right w:type="dxa" w:w="120"/>
+            </w:tcMar>
+          </w:tcPr>
+          <w:p>
+            <w:r>
+              <w:t>Cloud NAT + VPC</w:t>
+            </w:r>
+          </w:p>
+        </w:tc>
+        <w:tc>
+          <w:tcPr>
+            <w:tcW w:type="dxa" w:w="1330"/>
+            <w:tcBorders>
+              <w:top w:val="single" w:color="BBBBBB" w:sz="1"/>
+              <w:left w:val="single" w:color="BBBBBB" w:sz="1"/>
+              <w:bottom w:val="single" w:color="BBBBBB" w:sz="1"/>
+              <w:right w:val="single" w:color="BBBBBB" w:sz="1"/>
+            </w:tcBorders>
+            <w:shd w:fill="FFFFFF" w:val="clear"/>
+            <w:tcMar>
+              <w:top w:type="dxa" w:w="80"/>
+              <w:left w:type="dxa" w:w="120"/>
+              <w:bottom w:type="dxa" w:w="80"/>
+              <w:right w:type="dxa" w:w="120"/>
+            </w:tcMar>
+          </w:tcPr>
+          <w:p>
+            <w:r>
+              <w:t>1</w:t>
+            </w:r>
+          </w:p>
+        </w:tc>
+        <w:tc>
+          <w:tcPr>
+            <w:tcW w:type="dxa" w:w="2150"/>
+            <w:tcBorders>
+              <w:top w:val="single" w:color="BBBBBB" w:sz="1"/>
+              <w:left w:val="single" w:color="BBBBBB" w:sz="1"/>
+              <w:bottom w:val="single" w:color="BBBBBB" w:sz="1"/>
+              <w:right w:val="single" w:color="BBBBBB" w:sz="1"/>
+            </w:tcBorders>
+            <w:shd w:fill="FFFFFF" w:val="clear"/>
+            <w:tcMar>
+              <w:top w:type="dxa" w:w="80"/>
+              <w:left w:type="dxa" w:w="120"/>
+              <w:bottom w:type="dxa" w:w="80"/>
+              <w:right w:type="dxa" w:w="120"/>
+            </w:tcMar>
+          </w:tcPr>
+          <w:p>
+            <w:r>
+              <w:t>Salida a internet de los pods privados</w:t>
+            </w:r>
+          </w:p>
+        </w:tc>
+        <w:tc>
+          <w:tcPr>
+            <w:tcW w:type="dxa" w:w="1480"/>
+            <w:tcBorders>
+              <w:top w:val="single" w:color="BBBBBB" w:sz="1"/>
+              <w:left w:val="single" w:color="BBBBBB" w:sz="1"/>
+              <w:bottom w:val="single" w:color="BBBBBB" w:sz="1"/>
+              <w:right w:val="single" w:color="BBBBBB" w:sz="1"/>
+            </w:tcBorders>
+            <w:shd w:fill="FFFFFF" w:val="clear"/>
+            <w:tcMar>
+              <w:top w:type="dxa" w:w="80"/>
+              <w:left w:type="dxa" w:w="120"/>
+              <w:bottom w:type="dxa" w:w="80"/>
+              <w:right w:type="dxa" w:w="120"/>
+            </w:tcMar>
+          </w:tcPr>
+          <w:p>
+            <w:r>
+              <w:t>$35</w:t>
+            </w:r>
+          </w:p>
+        </w:tc>
+      </w:tr>
+      <w:tr>
+        <w:tc>
+          <w:tcPr>
+            <w:tcW w:type="dxa" w:w="2050"/>
+            <w:tcBorders>
+              <w:top w:val="single" w:color="BBBBBB" w:sz="1"/>
+              <w:left w:val="single" w:color="BBBBBB" w:sz="1"/>
+              <w:bottom w:val="single" w:color="BBBBBB" w:sz="1"/>
+              <w:right w:val="single" w:color="BBBBBB" w:sz="1"/>
+            </w:tcBorders>
+            <w:shd w:fill="FFFFFF" w:val="clear"/>
+            <w:tcMar>
+              <w:top w:type="dxa" w:w="80"/>
+              <w:left w:type="dxa" w:w="120"/>
+              <w:bottom w:type="dxa" w:w="80"/>
+              <w:right w:type="dxa" w:w="120"/>
+            </w:tcMar>
+          </w:tcPr>
+          <w:p>
+            <w:r>
+              <w:t>IA (Fase 5)</w:t>
+            </w:r>
+          </w:p>
+        </w:tc>
+        <w:tc>
+          <w:tcPr>
+            <w:tcW w:type="dxa" w:w="2350"/>
+            <w:tcBorders>
+              <w:top w:val="single" w:color="BBBBBB" w:sz="1"/>
+              <w:left w:val="single" w:color="BBBBBB" w:sz="1"/>
+              <w:bottom w:val="single" w:color="BBBBBB" w:sz="1"/>
+              <w:right w:val="single" w:color="BBBBBB" w:sz="1"/>
+            </w:tcBorders>
+            <w:shd w:fill="FFFFFF" w:val="clear"/>
+            <w:tcMar>
+              <w:top w:type="dxa" w:w="80"/>
+              <w:left w:type="dxa" w:w="120"/>
+              <w:bottom w:type="dxa" w:w="80"/>
+              <w:right w:type="dxa" w:w="120"/>
+            </w:tcMar>
+          </w:tcPr>
+          <w:p>
+            <w:r>
+              <w:t>Workers en GKE (HPA) + API LLM (Anthropic/OpenAI)</w:t>
+            </w:r>
+          </w:p>
+        </w:tc>
+        <w:tc>
+          <w:tcPr>
+            <w:tcW w:type="dxa" w:w="1330"/>
+            <w:tcBorders>
+              <w:top w:val="single" w:color="BBBBBB" w:sz="1"/>
+              <w:left w:val="single" w:color="BBBBBB" w:sz="1"/>
+              <w:bottom w:val="single" w:color="BBBBBB" w:sz="1"/>
+              <w:right w:val="single" w:color="BBBBBB" w:sz="1"/>
+            </w:tcBorders>
+            <w:shd w:fill="FFFFFF" w:val="clear"/>
+            <w:tcMar>
+              <w:top w:type="dxa" w:w="80"/>
+              <w:left w:type="dxa" w:w="120"/>
+              <w:bottom w:type="dxa" w:w="80"/>
+              <w:right w:type="dxa" w:w="120"/>
+            </w:tcMar>
+          </w:tcPr>
+          <w:p>
+            <w:r>
+              <w:t>según cola</w:t>
+            </w:r>
+          </w:p>
+        </w:tc>
+        <w:tc>
+          <w:tcPr>
+            <w:tcW w:type="dxa" w:w="2150"/>
+            <w:tcBorders>
+              <w:top w:val="single" w:color="BBBBBB" w:sz="1"/>
+              <w:left w:val="single" w:color="BBBBBB" w:sz="1"/>
+              <w:bottom w:val="single" w:color="BBBBBB" w:sz="1"/>
+              <w:right w:val="single" w:color="BBBBBB" w:sz="1"/>
+            </w:tcBorders>
+            <w:shd w:fill="FFFFFF" w:val="clear"/>
+            <w:tcMar>
+              <w:top w:type="dxa" w:w="80"/>
+              <w:left w:type="dxa" w:w="120"/>
+              <w:bottom w:type="dxa" w:w="80"/>
+              <w:right w:type="dxa" w:w="120"/>
+            </w:tcMar>
+          </w:tcPr>
+          <w:p>
+            <w:r>
+              <w:t>Asistente del entrenador</w:t>
+            </w:r>
+          </w:p>
+        </w:tc>
+        <w:tc>
+          <w:tcPr>
+            <w:tcW w:type="dxa" w:w="1480"/>
+            <w:tcBorders>
+              <w:top w:val="single" w:color="BBBBBB" w:sz="1"/>
+              <w:left w:val="single" w:color="BBBBBB" w:sz="1"/>
+              <w:bottom w:val="single" w:color="BBBBBB" w:sz="1"/>
+              <w:right w:val="single" w:color="BBBBBB" w:sz="1"/>
+            </w:tcBorders>
+            <w:shd w:fill="FFFFFF" w:val="clear"/>
+            <w:tcMar>
+              <w:top w:type="dxa" w:w="80"/>
+              <w:left w:type="dxa" w:w="120"/>
+              <w:bottom w:type="dxa" w:w="80"/>
+              <w:right w:type="dxa" w:w="120"/>
+            </w:tcMar>
+          </w:tcPr>
+          <w:p>
+            <w:r>
+              <w:t>variable por tokens</w:t>
+            </w:r>
+          </w:p>
+        </w:tc>
+      </w:tr>
+      <w:tr>
+        <w:tc>
+          <w:tcPr>
+            <w:tcW w:type="dxa" w:w="2050"/>
+            <w:tcBorders>
+              <w:top w:val="single" w:color="BBBBBB" w:sz="1"/>
+              <w:left w:val="single" w:color="BBBBBB" w:sz="1"/>
+              <w:bottom w:val="single" w:color="BBBBBB" w:sz="1"/>
+              <w:right w:val="single" w:color="BBBBBB" w:sz="1"/>
+            </w:tcBorders>
             <w:shd w:fill="F2F6FB" w:val="clear"/>
             <w:tcMar>
               <w:top w:type="dxa" w:w="80"/>
@@ -5536,14 +5876,7 @@
           </w:tcPr>
           <w:p>
             <w:r>
-              <w:rPr>
-                <w:b w:val="false"/>
-                <w:bCs w:val="false"/>
-                <w:color w:val="000000"/>
-                <w:sz w:val="20"/>
-                <w:szCs w:val="20"/>
-              </w:rPr>
-              <w:t xml:space="preserve">≈ $520 / mes</w:t>
+              <w:t>≈ $660 / mes (+ tokens de IA variables)</w:t>
             </w:r>
           </w:p>
         </w:tc>
@@ -5588,7 +5921,7 @@
           <w:i w:val="false"/>
           <w:iCs w:val="false"/>
         </w:rPr>
-        <w:t xml:space="preserve">con 5.000 entrenadores pagando una suscripción promedio de USD 15, el costo total de infraestructura (~USD 670) representa menos del 1% del MRR, validando la sostenibilidad del diseño. Los valores son aproximados (región us-central1, precios de lista sin descuentos por uso comprometido).</w:t>
+        <w:t>con 5.000 entrenadores pagando una suscripción promedio de USD 15, el costo total de infraestructura (~USD 810/mes, sin contar los tokens de IA, que son variables) representa alrededor del 1,1% del MRR, validando la sostenibilidad del diseño. Los valores son aproximados (región us-central1, precios de lista sin descuentos por uso comprometido).</w:t>
       </w:r>
     </w:p>
     <w:p>
@@ -5778,6 +6111,9 @@
           <w:iCs w:val="false"/>
         </w:rPr>
         <w:t xml:space="preserve">consumen la cola, arman el prompt con el contexto del alumno (historial, catálogo permitido, restricciones) y llaman a la API del LLM. Escalan con HPA según la profundidad de la cola, sin competir con el tráfico transaccional.</w:t>
+      </w:r>
+      <w:r>
+        <w:t xml:space="preserve"> El prompt restringe al modelo a usar únicamente ejercicios del catálogo (no inventar) y a respetar las restricciones médicas del alumno; la salida se valida contra el catálogo antes de mostrarla al entrenador.</w:t>
       </w:r>
     </w:p>
     <w:p>
@@ -5935,6 +6271,70 @@
       </w:pPr>
       <w:r>
         <w:t xml:space="preserve">Se elige la Opción A (consumo directo de APIs de LLM) porque los tres casos de uso operan sobre datos estructurados que ya viven en PostgreSQL (historial, catálogo, membresías) y caben en el contexto del prompt; no se necesita todavía una base vectorial. Esta decisión minimiza piezas nuevas de infraestructura y reutiliza patrones existentes (colas, workers, circuit breakers). Si a futuro el catálogo crece a miles de ejercicios con fichas técnicas extensas y documentos de los entrenadores, la evolución natural es incorporar RAG con una base vectorial, sin cambiar el esqueleto asíncrono ya diseñado: solo se agrega una etapa de retrieval previa al armado del prompt.</w:t>
+      </w:r>
+    </w:p>
+    <w:p>
+      <w:pPr>
+        <w:pStyle w:val="Heading2"/>
+      </w:pPr>
+      <w:r>
+        <w:t>5.4. Bosquejo de la Opción B: RAG (evolución futura)</w:t>
+      </w:r>
+    </w:p>
+    <w:p>
+      <w:r>
+        <w:t>Si el catálogo crece a miles de fichas técnicas extensas y se suman documentos propios de los entrenadores, la evolución es incorporar RAG (Retrieval-Augmented Generation) con una base de datos vectorial. El flujo tiene dos etapas. Ingesta (offline): las fuentes se parten en fragmentos (chunking), se convierten en vectores con un modelo de embeddings y se indexan en una base vectorial (Pinecone, Milvus o Chroma). Consulta (online): la pregunta se embebe, se recuperan por similitud los fragmentos más relevantes (top-k) y se inyectan en el prompt antes de llamar al LLM. RAG no cambia el esqueleto asíncrono ya diseñado (los mismos workers y colas de la Opción A): solo agrega el pipeline de ingesta y la etapa de retrieval previa al prompt. Se mantiene la Opción A hoy porque los datos relevantes ya viven estructurados en PostgreSQL y caben en el contexto; RAG se adopta cuando el conocimiento sea extenso y no estructurado.</w:t>
+      </w:r>
+    </w:p>
+    <w:p>
+      <w:pPr>
+        <w:jc w:val="center"/>
+      </w:pPr>
+      <w:r>
+        <w:drawing>
+          <wp:inline xmlns:a="http://schemas.openxmlformats.org/drawingml/2006/main" xmlns:pic="http://schemas.openxmlformats.org/drawingml/2006/picture">
+            <wp:extent cx="5760720" cy="2425666"/>
+            <wp:docPr id="11" name="Picture 11"/>
+            <wp:cNvGraphicFramePr>
+              <a:graphicFrameLocks noChangeAspect="1"/>
+            </wp:cNvGraphicFramePr>
+            <a:graphic>
+              <a:graphicData uri="http://schemas.openxmlformats.org/drawingml/2006/picture">
+                <pic:pic>
+                  <pic:nvPicPr>
+                    <pic:cNvPr id="0" name="fase5b_rag.png"/>
+                    <pic:cNvPicPr/>
+                  </pic:nvPicPr>
+                  <pic:blipFill>
+                    <a:blip r:embed="rId24"/>
+                    <a:stretch>
+                      <a:fillRect/>
+                    </a:stretch>
+                  </pic:blipFill>
+                  <pic:spPr>
+                    <a:xfrm>
+                      <a:off x="0" y="0"/>
+                      <a:ext cx="5760720" cy="2425666"/>
+                    </a:xfrm>
+                    <a:prstGeom prst="rect"/>
+                  </pic:spPr>
+                </pic:pic>
+              </a:graphicData>
+            </a:graphic>
+          </wp:inline>
+        </w:drawing>
+      </w:r>
+    </w:p>
+    <w:p>
+      <w:pPr>
+        <w:jc w:val="center"/>
+      </w:pPr>
+      <w:r>
+        <w:rPr>
+          <w:i/>
+          <w:sz w:val="18"/>
+        </w:rPr>
+        <w:t>Figura 6 – Flujo RAG (Opción B): ingesta de documentos y retrieval previo al prompt.</w:t>
       </w:r>
     </w:p>
     <w:p>

</xml_diff>

<commit_message>
corrige la figura 2 y el informe agregando los componentes transversales (revision del profesor)
</commit_message>
<xml_diff>
--- a/Material/TFI_TrainerOS.docx
+++ b/Material/TFI_TrainerOS.docx
@@ -972,6 +972,21 @@
       </w:r>
     </w:p>
     <w:p>
+      <w:pPr/>
+      <w:r>
+        <w:rPr>
+          <w:b/>
+        </w:rPr>
+        <w:t xml:space="preserve">Componentes transversales de la plataforma. </w:t>
+      </w:r>
+      <w:r>
+        <w:rPr>
+          <w:b w:val="0"/>
+        </w:rPr>
+        <w:t>Más allá del API Gateway y de los microservicios de negocio, una arquitectura de microservicios con comunicación síncrona requiere un conjunto de servicios de soporte que operan de forma transversal a todos los servicios: (a) un Balanceador de carga que distribuye el tráfico entrante y reparte las peticiones entre las réplicas de cada servicio; (b) un Service Discovery / Registry (Consul o Eureka) para que los servicios se registren y se localicen entre sí de forma dinámica, sin URLs fijas, a medida que escalan o reemplazan instancias; (c) un Config Server que centraliza la configuración por ambiente (dev, staging, producción) y evita credenciales y parámetros dispersos en cada servicio; y (d) una capa de Observabilidad —logging centralizado, métricas y trazas distribuidas con correlation-id— imprescindible cuando una misma petición atraviesa varios servicios en cadena y hay que poder seguir su recorrido y diagnosticar fallos. Estos componentes se reflejan en la Figura 2.</w:t>
+      </w:r>
+    </w:p>
+    <w:p>
       <w:pPr>
         <w:spacing w:after="80" w:before="200"/>
         <w:jc w:val="center"/>
@@ -979,7 +994,7 @@
       <w:r>
         <w:drawing>
           <wp:inline xmlns:a="http://schemas.openxmlformats.org/drawingml/2006/main" xmlns:pic="http://schemas.openxmlformats.org/drawingml/2006/picture">
-            <wp:extent cx="5905500" cy="2806340"/>
+            <wp:extent cx="5905500" cy="2516016"/>
             <wp:docPr id="3" name="Picture 3"/>
             <wp:cNvGraphicFramePr>
               <a:graphicFrameLocks noChangeAspect="1"/>
@@ -1000,7 +1015,7 @@
                   <pic:spPr>
                     <a:xfrm>
                       <a:off x="0" y="0"/>
-                      <a:ext cx="5905500" cy="2806340"/>
+                      <a:ext cx="5905500" cy="2516016"/>
                     </a:xfrm>
                     <a:prstGeom prst="rect"/>
                   </pic:spPr>

</xml_diff>